<commit_message>
Logo: mehr Abstand zwischen „Alltagsfels“ und Unterzeile
Der Bogen des „g“ berührte die Zeile „Betreuung im Alltag“. Logo auf
Website, in allen Druckvorlagen, PNG-Dateien und der Word-Vorlage erneuert.

Co-Authored-By: Claude Opus 5.5 <noreply@anthropic.com>
Claude-Session: https://claude.ai/code/session_016KN9emBpvtcB3Du7KDU7Xc
</commit_message>
<xml_diff>
--- a/druckvorlagen/word/alltagsfels-briefvorlage.docx
+++ b/druckvorlagen/word/alltagsfels-briefvorlage.docx
@@ -595,7 +595,7 @@
           <wp:positionV relativeFrom="page">
             <wp:posOffset>468000</wp:posOffset>
           </wp:positionV>
-          <wp:extent cx="2592000" cy="540864"/>
+          <wp:extent cx="2592000" cy="595296"/>
           <wp:effectExtent l="0" t="0" r="0" b="0"/>
           <wp:wrapNone/>
           <wp:docPr id="1" name="Picture 1"/>
@@ -616,7 +616,7 @@
                 <pic:spPr>
                   <a:xfrm>
                     <a:off x="0" y="0"/>
-                    <a:ext cx="2592000" cy="540864"/>
+                    <a:ext cx="2592000" cy="595296"/>
                   </a:xfrm>
                   <a:prstGeom prst="rect"/>
                 </pic:spPr>

</xml_diff>

<commit_message>
Druckvorlagen: neues Logo „Hand reichen auf dem Fels“ und Farben Dunkelgrün/Ocker
Logo nach Julians Vorlage als Vektor nachgebaut (quer, stehend mit Spruch,
Bild, kleine Fassung, App-Symbol, Favicon). Alle Vorlagen, Zeichnungen,
Signaturen und die Word-Vorlage auf die neuen Farben umgestellt; Rückseite
der Visitenkarte zeigt das stehende Logo. Helle Logo-Fassungen entfernt.

Co-Authored-By: Claude Opus 5.5 (1M context) <noreply@anthropic.com>
Claude-Session: https://claude.ai/code/session_01LjGXQZ88Uhkn8it41mN5mk
</commit_message>
<xml_diff>
--- a/druckvorlagen/word/alltagsfels-briefvorlage.docx
+++ b/druckvorlagen/word/alltagsfels-briefvorlage.docx
@@ -72,7 +72,7 @@
               <w:rPr>
                 <w:rFonts w:ascii="Atkinson Hyperlegible" w:hAnsi="Atkinson Hyperlegible" w:cs="Atkinson Hyperlegible" w:eastAsia="Atkinson Hyperlegible"/>
                 <w:b/>
-                <w:color w:val="173A66"/>
+                <w:color w:val="2B3328"/>
                 <w:sz w:val="22"/>
               </w:rPr>
               <w:t xml:space="preserve">Ihr Ansprechpartner: </w:t>
@@ -93,7 +93,7 @@
               <w:rPr>
                 <w:rFonts w:ascii="Atkinson Hyperlegible" w:hAnsi="Atkinson Hyperlegible" w:cs="Atkinson Hyperlegible" w:eastAsia="Atkinson Hyperlegible"/>
                 <w:b/>
-                <w:color w:val="173A66"/>
+                <w:color w:val="2B3328"/>
                 <w:sz w:val="22"/>
               </w:rPr>
               <w:t xml:space="preserve">Telefon: </w:t>
@@ -116,7 +116,7 @@
               <w:rPr>
                 <w:rFonts w:ascii="Atkinson Hyperlegible" w:hAnsi="Atkinson Hyperlegible" w:cs="Atkinson Hyperlegible" w:eastAsia="Atkinson Hyperlegible"/>
                 <w:b/>
-                <w:color w:val="173A66"/>
+                <w:color w:val="2B3328"/>
                 <w:sz w:val="22"/>
               </w:rPr>
               <w:t xml:space="preserve">E-Mail: </w:t>
@@ -139,7 +139,7 @@
               <w:rPr>
                 <w:rFonts w:ascii="Atkinson Hyperlegible" w:hAnsi="Atkinson Hyperlegible" w:cs="Atkinson Hyperlegible" w:eastAsia="Atkinson Hyperlegible"/>
                 <w:b/>
-                <w:color w:val="173A66"/>
+                <w:color w:val="2B3328"/>
                 <w:sz w:val="22"/>
               </w:rPr>
               <w:t xml:space="preserve">Internet: </w:t>
@@ -160,7 +160,7 @@
               <w:rPr>
                 <w:rFonts w:ascii="Atkinson Hyperlegible" w:hAnsi="Atkinson Hyperlegible" w:cs="Atkinson Hyperlegible" w:eastAsia="Atkinson Hyperlegible"/>
                 <w:b/>
-                <w:color w:val="173A66"/>
+                <w:color w:val="2B3328"/>
                 <w:sz w:val="22"/>
               </w:rPr>
               <w:t xml:space="preserve">Datum: </w:t>
@@ -378,7 +378,7 @@
             <w:rPr>
               <w:rFonts w:ascii="Atkinson Hyperlegible" w:hAnsi="Atkinson Hyperlegible" w:cs="Atkinson Hyperlegible" w:eastAsia="Atkinson Hyperlegible"/>
               <w:b/>
-              <w:color w:val="173A66"/>
+              <w:color w:val="2B3328"/>
               <w:sz w:val="17"/>
             </w:rPr>
             <w:t>Alltagsfels UG</w:t>
@@ -392,7 +392,7 @@
             <w:rPr>
               <w:rFonts w:ascii="Atkinson Hyperlegible" w:hAnsi="Atkinson Hyperlegible" w:cs="Atkinson Hyperlegible" w:eastAsia="Atkinson Hyperlegible"/>
               <w:b/>
-              <w:color w:val="173A66"/>
+              <w:color w:val="2B3328"/>
               <w:sz w:val="17"/>
             </w:rPr>
             <w:t>(haftungsbeschränkt)</w:t>
@@ -595,7 +595,7 @@
           <wp:positionV relativeFrom="page">
             <wp:posOffset>468000</wp:posOffset>
           </wp:positionV>
-          <wp:extent cx="2592000" cy="595296"/>
+          <wp:extent cx="2592000" cy="673920"/>
           <wp:effectExtent l="0" t="0" r="0" b="0"/>
           <wp:wrapNone/>
           <wp:docPr id="1" name="Picture 1"/>
@@ -616,7 +616,7 @@
                 <pic:spPr>
                   <a:xfrm>
                     <a:off x="0" y="0"/>
-                    <a:ext cx="2592000" cy="595296"/>
+                    <a:ext cx="2592000" cy="673920"/>
                   </a:xfrm>
                   <a:prstGeom prst="rect"/>
                 </pic:spPr>

</xml_diff>